<commit_message>
Reorganizacion en paquetes + capa conversacional + mejoras de calidad
Estructura: nucleo/ (motor y adaptadores), interfaces/ (api + 3 frontends),
evaluacion/, datos/. El nucleo expone la logica por API y cualquier frontend
la consume.

Frontends: React+Vite y widget embebible ademas de Streamlit, los tres sobre
el mismo motor. Tema oscuro e iconos SVG.

Motor: capa conversacional (saludos, reformulaciones, seguimientos con
historial). Segmentacion del corpus por articulo (recall 82.5% a 93%).
Cita literal verificada como capa anti-alucinacion.

Correcciones: bug de registro en la API, carga unica de keys (config.py),
rutas del indice relativas, cierre de path traversal en el visor, y
python-multipart en requirements.

Documentacion: notas de anti-alucinacion, evaluacion y frontends.
</commit_message>
<xml_diff>
--- a/documentacion/Guia_Tecnica_Sistema.docx
+++ b/documentacion/Guia_Tecnica_Sistema.docx
@@ -522,7 +522,19 @@
         <w:rPr>
           <w:lang w:val="es-MX"/>
         </w:rPr>
-        <w:t xml:space="preserve">rag.py NO conoce ChromaDB ni Gemini directamente; </w:t>
+        <w:t xml:space="preserve">rag.py NO </w:t>
+      </w:r>
+      <w:r>
+        <w:rPr>
+          <w:lang w:val="es-MX"/>
+        </w:rPr>
+        <w:t>interactúa con</w:t>
+      </w:r>
+      <w:r>
+        <w:rPr>
+          <w:lang w:val="es-MX"/>
+        </w:rPr>
+        <w:t xml:space="preserve"> ChromaDB ni Gemini directamente; </w:t>
       </w:r>
       <w:r>
         <w:rPr>
@@ -761,6 +773,7 @@
             <w:r>
               <w:rPr>
                 <w:rFonts w:ascii="Consolas" w:hAnsi="Consolas"/>
+                <w:noProof/>
                 <w:sz w:val="18"/>
                 <w:lang w:val="es-MX"/>
               </w:rPr>
@@ -1213,6 +1226,9 @@
           </w:tcPr>
           <w:p>
             <w:r>
+              <w:rPr>
+                <w:noProof/>
+              </w:rPr>
               <w:drawing>
                 <wp:inline distT="0" distB="0" distL="0" distR="0" wp14:anchorId="7127E01B" wp14:editId="21CD578F">
                   <wp:extent cx="5486400" cy="3622040"/>
@@ -1268,15 +1284,7 @@
           <w:color w:val="1F3864"/>
           <w:sz w:val="28"/>
         </w:rPr>
-        <w:t xml:space="preserve">6. </w:t>
-      </w:r>
-      <w:r>
-        <w:rPr>
-          <w:b/>
-          <w:color w:val="1F3864"/>
-          <w:sz w:val="28"/>
-        </w:rPr>
-        <w:t>Coseno  para similitudes</w:t>
+        <w:t>6. Coseno  para similitudes</w:t>
       </w:r>
     </w:p>
     <w:p>
@@ -1288,6 +1296,7 @@
       </w:pPr>
       <w:r>
         <w:rPr>
+          <w:noProof/>
           <w:lang w:val="es-MX"/>
         </w:rPr>
         <w:lastRenderedPageBreak/>

</xml_diff>